<commit_message>
Expand manuscript with literature survey
</commit_message>
<xml_diff>
--- a/adaptive-beam-research/paper/adaptive_beam_fg_manuscript.docx
+++ b/adaptive-beam-research/paper/adaptive_beam_fg_manuscript.docx
@@ -100,6 +100,222 @@
       </w:pPr>
       <w:r>
         <w:t>The exact graph realizations used by the original paper are not distributed with the paper supplied to this project. Accordingly, the experiments below use deterministic generated LFR graphs with the paper's published macro parameters. The results are implementation results on those realizations, not claims that the paper's original Table III-V numbers have been reproduced.</w:t>
+      </w:r>
+    </w:p>
+    <w:p>
+      <w:pPr>
+        <w:pStyle w:val="Heading1"/>
+      </w:pPr>
+      <w:r>
+        <w:t>Literature Survey</w:t>
+      </w:r>
+    </w:p>
+    <w:p>
+      <w:pPr>
+        <w:pStyle w:val="Heading2"/>
+      </w:pPr>
+      <w:r>
+        <w:t>From global partitions to local search</w:t>
+      </w:r>
+    </w:p>
+    <w:p>
+      <w:pPr>
+        <w:pStyle w:val="BodyText"/>
+      </w:pPr>
+      <w:r>
+        <w:t>Early community detection work usually treated the task as a partitioning problem over the entire graph. Divisive methods based on edge betweenness and modularity made the idea of a community concrete by looking for groups with more internal structure than expected under a null model [newman2004,fortunato2010]. Hierarchical agglomeration later made large networks easier to process by maintaining community-level statistics during merging [clauset2004]. These methods are useful when a full map of the network is required, but they can do unnecessary work when an application has one query node and needs only its surrounding group.</w:t>
+      </w:r>
+    </w:p>
+    <w:p>
+      <w:pPr>
+        <w:pStyle w:val="BodyText"/>
+      </w:pPr>
+      <w:r>
+        <w:t>Local community detection changes the question. Given a seed node or a small seed set, it seeks a nearby community while inspecting only a limited part of the graph. Andersen and Lang showed that seed-set expansion can be connected to conductance guarantees and can be carried out without examining the whole network [andersen2006]. Clauset developed a local fitness search that adds boundary nodes while the community score improves, illustrating the practical value of local decisions on large networks [clauset2005]. The local setting also creates a clear weakness: a decision that is acceptable at one step can remove the best route to the community at a later step.</w:t>
+      </w:r>
+    </w:p>
+    <w:p>
+      <w:pPr>
+        <w:pStyle w:val="Heading2"/>
+      </w:pPr>
+      <w:r>
+        <w:t>Modularity, conductance, and local fitness</w:t>
+      </w:r>
+    </w:p>
+    <w:p>
+      <w:pPr>
+        <w:pStyle w:val="BodyText"/>
+      </w:pPr>
+      <w:r>
+        <w:t>Modularity compares the observed number of internal edges with the number expected under a degree-preserving null model. It became a standard way to compare candidate partitions because it rewards dense internal connections and penalizes excessive boundary links [newman2006]. In a seed expansion algorithm, however, a local modularity change is not the same as the quality of the final community. The denominator changes after every addition, and a candidate with a good immediate change may expose poor boundary nodes later.</w:t>
+      </w:r>
+    </w:p>
+    <w:p>
+      <w:pPr>
+        <w:pStyle w:val="BodyText"/>
+      </w:pPr>
+      <w:r>
+        <w:t>Conductance and related flow measures offer a different view. They emphasize the cut between a community and the rest of the graph and have been used to give local methods both a stopping rule and a connection to graph partitioning theory [andersen2006]. Fitness-based methods take a more direct route by balancing internal links against the external degree. Lancichinetti, Fortunato, and Kertesz used a local fitness function to identify overlapping and hierarchical communities, with a resolution parameter controlling the scale of the result [lancichinetti2009]. These approaches demonstrate that local criteria can find meaningful groups, but they also show why the choice of the growth rule and stopping condition matters.</w:t>
+      </w:r>
+    </w:p>
+    <w:p>
+      <w:pPr>
+        <w:pStyle w:val="BodyText"/>
+      </w:pPr>
+      <w:r>
+        <w:t>The folded-subgraph method considered in this work occupies a related middle ground. It first groups tightly connected neighboring nodes and then applies a local modularity expansion followed by a relaxation step. The folding stage reduces the number of individual decisions, while the density condition keeps the candidate group locally coherent. The method is therefore more structured than a single-node greedy expansion, but its modularity stage still commits to one immediate winner. The present work focuses on that specific search decision rather than replacing the original density or modularity definitions.</w:t>
+      </w:r>
+    </w:p>
+    <w:p>
+      <w:pPr>
+        <w:pStyle w:val="Heading2"/>
+      </w:pPr>
+      <w:r>
+        <w:t>Benchmarks and evaluation practice</w:t>
+      </w:r>
+    </w:p>
+    <w:p>
+      <w:pPr>
+        <w:pStyle w:val="BodyText"/>
+      </w:pPr>
+      <w:r>
+        <w:t>Synthetic benchmarks are important because real networks rarely provide a complete and undisputed ground truth. The LFR benchmark introduced by Lancichinetti, Fortunato, and Radicchi varies degree and community-size distributions instead of relying on uniform toy graphs [lfr2008]. It therefore exposes failures that may remain hidden on small regular examples. The same authors later extended the benchmark to directed and weighted networks with overlapping communities [lfr2009]. Comparative studies have used these generators to show that algorithm rankings can change with degree heterogeneity, mixing, community size, and overlap [lfrcomparative].</w:t>
+      </w:r>
+    </w:p>
+    <w:p>
+      <w:pPr>
+        <w:pStyle w:val="BodyText"/>
+      </w:pPr>
+      <w:r>
+        <w:t>Evaluation should consequently report more than one average score. Recall is useful when missing a true member is costly, precision is useful when boundary noise is costly, and F1 summarizes the balance between them. Runtime matters as well because a local method is often chosen for repeated queries. Repeated seeds and held-out graph realizations are preferable to a single favorable example. Parameter selection must also remain separate from final testing; otherwise a method can appear stronger simply because it has been adjusted to the test graphs.</w:t>
+      </w:r>
+    </w:p>
+    <w:p>
+      <w:pPr>
+        <w:pStyle w:val="Heading2"/>
+      </w:pPr>
+      <w:r>
+        <w:t>Search, ranking, and the gap addressed here</w:t>
+      </w:r>
+    </w:p>
+    <w:p>
+      <w:pPr>
+        <w:pStyle w:val="BodyText"/>
+      </w:pPr>
+      <w:r>
+        <w:t>Greedy expansion is attractive because it is simple and fast, but its main limitation is path dependence. Once a node or folded group is accepted, the algorithm changes the candidate boundary and cannot return to a discarded alternative. Beam search addresses this limitation by retaining a small set of partial solutions. The idea has also appeared in recent community-search systems that combine local exploration with a learned or optimized ranking function [communityaf]. The added search width, however, can multiply the number of folded-subgraph computations. A practical local method needs a way to limit the expensive part of the search.</w:t>
+      </w:r>
+    </w:p>
+    <w:p>
+      <w:pPr>
+        <w:pStyle w:val="BodyText"/>
+      </w:pPr>
+      <w:r>
+        <w:t>This paper uses a narrow intervention. The original folded representation, density threshold, modularity change, non-negative acceptance rule, and relaxation stage are kept. Only the expansion policy changes: a small beam retains alternative paths, and a validation-selected candidate budget limits how many boundary nodes are folded exactly. A logistic compatibility score is used as a secondary ranking signal, not as a replacement for the modularity criterion. This design makes the source of any improvement easier to inspect: if the result changes, the change is attributable to search and candidate budgeting rather than a new community definition.</w:t>
+      </w:r>
+    </w:p>
+    <w:p>
+      <w:pPr>
+        <w:pStyle w:val="Heading2"/>
+      </w:pPr>
+      <w:r>
+        <w:t>Position of the present study</w:t>
+      </w:r>
+    </w:p>
+    <w:p>
+      <w:pPr>
+        <w:pStyle w:val="BodyText"/>
+      </w:pPr>
+      <w:r>
+        <w:t>The literature establishes four points that guide the experiments. First, local detection is appropriate when the query concerns one seed or a small neighborhood. Second, local quality functions are useful but can be affected by irreversible growth decisions. Third, heterogeneous benchmarks are needed to reveal regime-dependent behavior. Fourth, a local method should report precision, recall, F1, runtime, and the validation protocol together. The contribution of AdaptiveBeam is to combine these points in a controlled extension of folded-subgraph expansion. It is not presented as a replacement for all community detection methods; it is a test of whether limited multi-path search improves one specific greedy stage.</w:t>
+      </w:r>
+    </w:p>
+    <w:p>
+      <w:pPr>
+        <w:pStyle w:val="Heading2"/>
+      </w:pPr>
+      <w:r>
+        <w:t>Comparison with common method families</w:t>
+      </w:r>
+    </w:p>
+    <w:p>
+      <w:pPr>
+        <w:pStyle w:val="BodyText"/>
+      </w:pPr>
+      <w:r>
+        <w:t>The methods in the literature can be grouped by the information they use and the way they decide when to stop. Global partitioning methods use statistics from the entire graph. Their advantage is a consistent view of all nodes, but the cost can be unnecessary for a single query. They also return a partition even when the application is interested in one seed-centered group. Local methods avoid this cost by working from a seed, but their result depends more strongly on the starting point and on the growth rule.</w:t>
+      </w:r>
+    </w:p>
+    <w:p>
+      <w:pPr>
+        <w:pStyle w:val="BodyText"/>
+      </w:pPr>
+      <w:r>
+        <w:t>Flow-based local methods are attractive when a community is separated by a small boundary. They use a seed preference and a conductance-like objective, which gives the search a connection to graph cuts. Their output is often stable when the seed lies well inside the target community. A seed close to a boundary can still lead to a different answer, especially when two groups share many links. The folded-subgraph construction responds to this problem by treating a dense group of neighboring nodes as one candidate, so the decision is based on a small local structure instead of one boundary node.</w:t>
+      </w:r>
+    </w:p>
+    <w:p>
+      <w:pPr>
+        <w:pStyle w:val="BodyText"/>
+      </w:pPr>
+      <w:r>
+        <w:t>Fitness methods and modularity methods make a different tradeoff. Fitness usually gives an easy-to-compute local score and can support overlapping communities. Modularity gives a more explicit comparison with a null model, but its value depends on both internal edges and the boundary. In the present implementation, modularity is retained because it is the criterion used by the source method. The beam extension is therefore compatible with the original analysis: it compares the same candidate gains, but it does not force the best immediate gain to be the only path carried forward.</w:t>
+      </w:r>
+    </w:p>
+    <w:p>
+      <w:pPr>
+        <w:pStyle w:val="BodyText"/>
+      </w:pPr>
+      <w:r>
+        <w:t>Learning-based methods can rank candidates from graph features, but a learned ranker can also hide the reason for a decision. A model trained on one graph family may prefer the wrong boundary behavior on another family. For that reason, the scorer in this study has a limited role. It contributes a small secondary term after the modularity calculation, and all settings are fixed before the held-out graphs are evaluated. The main comparison is consequently between greedy search, unrestricted beam search, and budgeted beam search.</w:t>
+      </w:r>
+    </w:p>
+    <w:p>
+      <w:pPr>
+        <w:pStyle w:val="Heading2"/>
+      </w:pPr>
+      <w:r>
+        <w:t>Why a small beam is a reasonable design choice</w:t>
+      </w:r>
+    </w:p>
+    <w:p>
+      <w:pPr>
+        <w:pStyle w:val="BodyText"/>
+      </w:pPr>
+      <w:r>
+        <w:t>An exhaustive search over all candidate paths is not suitable for repeated local queries. If a boundary has many candidates, the number of possible communities grows rapidly with search depth. A beam keeps only the strongest partial communities at each level. It is not guaranteed to find the global best community, but it gives the algorithm a chance to preserve a route that would be lost by greedy expansion.</w:t>
+      </w:r>
+    </w:p>
+    <w:p>
+      <w:pPr>
+        <w:pStyle w:val="BodyText"/>
+      </w:pPr>
+      <w:r>
+        <w:t>The beam width must be chosen with care. A wide beam can improve coverage of possible paths while increasing folding and modularity calculations. It can also keep several similar communities and spend work exploring duplicates. A small width is easier to cache and easier to inspect. The present study uses a width of two and a maximum depth of five, with duplicate communities removed at every level. The candidate budget adds a second control: boundary nodes are first ordered by inexpensive local information, and only a fixed prefix is folded exactly. The budget is selected on validation graphs rather than on the held-out LFR6-LFR9 graphs.</w:t>
+      </w:r>
+    </w:p>
+    <w:p>
+      <w:pPr>
+        <w:pStyle w:val="Heading2"/>
+      </w:pPr>
+      <w:r>
+        <w:t>Open issues identified by prior work</w:t>
+      </w:r>
+    </w:p>
+    <w:p>
+      <w:pPr>
+        <w:pStyle w:val="BodyText"/>
+      </w:pPr>
+      <w:r>
+        <w:t>Several issues remain open across local community detection studies. There is no single definition of a community that works equally well for all networks. Degree heterogeneity can make a high-degree boundary node look important even when it belongs to another group. Overlap makes the ground truth itself less clear. Resolution parameters can change the size of the returned group, and different benchmark generators can produce different algorithm rankings.</w:t>
+      </w:r>
+    </w:p>
+    <w:p>
+      <w:pPr>
+        <w:pStyle w:val="BodyText"/>
+      </w:pPr>
+      <w:r>
+        <w:t>These issues affect the interpretation of the present results. A higher F1 on one LFR setting does not prove that the returned community is better for every application. It only shows that the predicted and planted memberships agree more closely under that setting. Similarly, a lower runtime in this Java implementation is evidence about this implementation and hardware, not a general theorem about all beam methods. The study therefore reports the dataset-level pattern, the per-seed counts, and the limitations together.</w:t>
       </w:r>
     </w:p>
     <w:p>
@@ -2901,6 +3117,87 @@
         <w:ind w:left="259" w:hanging="259"/>
       </w:pPr>
       <w:r>
+        <w:t>M. E. J. Newman and M. Girvan, ``Finding and evaluating community structure in networks,'' Physical Review E, vol. 69, no. 2, Art. no. 026113, 2004.</w:t>
+      </w:r>
+    </w:p>
+    <w:p>
+      <w:pPr>
+        <w:pStyle w:val="BodyText"/>
+        <w:ind w:left="259" w:hanging="259"/>
+      </w:pPr>
+      <w:r>
+        <w:t>A. Clauset, M. E. J. Newman, and C. Moore, ``Finding community structure in very large networks,'' Physical Review E, vol. 70, no. 6, Art. no. 066111, 2004.</w:t>
+      </w:r>
+    </w:p>
+    <w:p>
+      <w:pPr>
+        <w:pStyle w:val="BodyText"/>
+        <w:ind w:left="259" w:hanging="259"/>
+      </w:pPr>
+      <w:r>
+        <w:t>R. Andersen and K. J. Lang, ``Communities from seed sets,'' in Proceedings of the 15th International Conference on World Wide Web, 2006, pp. 223-232.</w:t>
+      </w:r>
+    </w:p>
+    <w:p>
+      <w:pPr>
+        <w:pStyle w:val="BodyText"/>
+        <w:ind w:left="259" w:hanging="259"/>
+      </w:pPr>
+      <w:r>
+        <w:t>A. Clauset, ``Finding local community structure in networks,'' Physical Review E, vol. 72, no. 2, Art. no. 026132, 2005.</w:t>
+      </w:r>
+    </w:p>
+    <w:p>
+      <w:pPr>
+        <w:pStyle w:val="BodyText"/>
+        <w:ind w:left="259" w:hanging="259"/>
+      </w:pPr>
+      <w:r>
+        <w:t>S. Fortunato, ``Community detection in graphs,'' Physics Reports, vol. 486, no. 3-5, pp. 75-174, 2010.</w:t>
+      </w:r>
+    </w:p>
+    <w:p>
+      <w:pPr>
+        <w:pStyle w:val="BodyText"/>
+        <w:ind w:left="259" w:hanging="259"/>
+      </w:pPr>
+      <w:r>
+        <w:t>A. Lancichinetti, S. Fortunato, and J. Kertesz, ``Detecting the overlapping and hierarchical community structure in complex networks,'' New Journal of Physics, vol. 11, Art. no. 033015, 2009.</w:t>
+      </w:r>
+    </w:p>
+    <w:p>
+      <w:pPr>
+        <w:pStyle w:val="BodyText"/>
+        <w:ind w:left="259" w:hanging="259"/>
+      </w:pPr>
+      <w:r>
+        <w:t>A. Lancichinetti and S. Fortunato, ``Benchmarks for testing community detection algorithms on directed and weighted graphs with overlapping communities,'' Physical Review E, vol. 80, no. 1, Art. no. 016118, 2009.</w:t>
+      </w:r>
+    </w:p>
+    <w:p>
+      <w:pPr>
+        <w:pStyle w:val="BodyText"/>
+        <w:ind w:left="259" w:hanging="259"/>
+      </w:pPr>
+      <w:r>
+        <w:t>A. Lancichinetti and S. Fortunato, ``Community detection algorithms: a comparative analysis,'' Physical Review E, vol. 80, no. 5, Art. no. 056117, 2009.</w:t>
+      </w:r>
+    </w:p>
+    <w:p>
+      <w:pPr>
+        <w:pStyle w:val="BodyText"/>
+        <w:ind w:left="259" w:hanging="259"/>
+      </w:pPr>
+      <w:r>
+        <w:t>Y. Li, J. Zhang, and X. Lin, ``CommunityAF: An example-based community search method via autoregressive flow,'' Proceedings of the VLDB Endowment, vol. 16, no. 9, pp. 2266-2278, 2023.</w:t>
+      </w:r>
+    </w:p>
+    <w:p>
+      <w:pPr>
+        <w:pStyle w:val="BodyText"/>
+        <w:ind w:left="259" w:hanging="259"/>
+      </w:pPr>
+      <w:r>
         <w:t>Y. Freund and R. E. Schapire, ``A decision-theoretic generalization of on-line learning and an application to boosting,'' Journal of Computer and System Sciences, vol. 55, no. 1, pp. 119-139, 1997.</w:t>
       </w:r>
     </w:p>

</xml_diff>